<commit_message>
fix: a list right after a paragraph line is a list, as GitHub renders it (lists_without_preceding_blankline) - in both engines.
</commit_message>
<xml_diff>
--- a/tests/golden/expected/md-commonmark/calls/call-01/files/generated.docx
+++ b/tests/golden/expected/md-commonmark/calls/call-01/files/generated.docx
@@ -311,6 +311,36 @@
       </w:pPr>
       <w:r>
         <w:t xml:space="preserve">another</w:t>
+      </w:r>
+    </w:p>
+    <w:p>
+      <w:pPr>
+        <w:pStyle w:val="FirstParagraph"/>
+      </w:pPr>
+      <w:r>
+        <w:rPr>
+          <w:b/>
+          <w:bCs/>
+        </w:rPr>
+        <w:t xml:space="preserve">A label, then a list with no blank line between:</w:t>
+      </w:r>
+      <w:r>
+        <w:t xml:space="preserve"> </w:t>
+      </w:r>
+      <w:r>
+        <w:t xml:space="preserve">- first, as GitHub renders it</w:t>
+      </w:r>
+      <w:r>
+        <w:t xml:space="preserve"> </w:t>
+      </w:r>
+      <w:r>
+        <w:t xml:space="preserve">- second</w:t>
+      </w:r>
+      <w:r>
+        <w:t xml:space="preserve"> </w:t>
+      </w:r>
+      <w:r>
+        <w:t xml:space="preserve">- nested</w:t>
       </w:r>
     </w:p>
     <w:p>

</xml_diff>